<commit_message>
added class scheduler procedures
</commit_message>
<xml_diff>
--- a/DB_Phase02_Report.docx
+++ b/DB_Phase02_Report.docx
@@ -1,6 +1,6 @@
 
 <file path=word/document.xml><?xml version="1.0" encoding="utf-8"?>
-<w:document xmlns:wpc="http://schemas.microsoft.com/office/word/2010/wordprocessingCanvas" xmlns:cx="http://schemas.microsoft.com/office/drawing/2014/chartex" xmlns:cx1="http://schemas.microsoft.com/office/drawing/2015/9/8/chartex" xmlns:cx2="http://schemas.microsoft.com/office/drawing/2015/10/21/chartex" xmlns:cx3="http://schemas.microsoft.com/office/drawing/2016/5/9/chartex" xmlns:cx4="http://schemas.microsoft.com/office/drawing/2016/5/10/chartex" xmlns:cx5="http://schemas.microsoft.com/office/drawing/2016/5/11/chartex" xmlns:cx6="http://schemas.microsoft.com/office/drawing/2016/5/12/chartex" xmlns:cx7="http://schemas.microsoft.com/office/drawing/2016/5/13/chartex" xmlns:cx8="http://schemas.microsoft.com/office/drawing/2016/5/14/chartex" xmlns:mc="http://schemas.openxmlformats.org/markup-compatibility/2006" xmlns:aink="http://schemas.microsoft.com/office/drawing/2016/ink" xmlns:am3d="http://schemas.microsoft.com/office/drawing/2017/model3d" xmlns:o="urn:schemas-microsoft-com:office:office" xmlns:oel="http://schemas.microsoft.com/office/2019/extlst" xmlns:r="http://schemas.openxmlformats.org/officeDocument/2006/relationships" xmlns:m="http://schemas.openxmlformats.org/officeDocument/2006/math" xmlns:v="urn:schemas-microsoft-com:vml" xmlns:wp14="http://schemas.microsoft.com/office/word/2010/wordprocessingDrawing" xmlns:wp="http://schemas.openxmlformats.org/drawingml/2006/wordprocessingDrawing" xmlns:w10="urn:schemas-microsoft-com:office:word" xmlns:w="http://schemas.openxmlformats.org/wordprocessingml/2006/main" xmlns:w14="http://schemas.microsoft.com/office/word/2010/wordml" xmlns:w15="http://schemas.microsoft.com/office/word/2012/wordml" xmlns:w16cex="http://schemas.microsoft.com/office/word/2018/wordml/cex" xmlns:w16cid="http://schemas.microsoft.com/office/word/2016/wordml/cid" xmlns:w16="http://schemas.microsoft.com/office/word/2018/wordml" xmlns:w16du="http://schemas.microsoft.com/office/word/2023/wordml/word16du" xmlns:w16sdtdh="http://schemas.microsoft.com/office/word/2020/wordml/sdtdatahash" xmlns:w16sdtfl="http://schemas.microsoft.com/office/word/2024/wordml/sdtformatlock" xmlns:w16se="http://schemas.microsoft.com/office/word/2015/wordml/symex" xmlns:wpg="http://schemas.microsoft.com/office/word/2010/wordprocessingGroup" xmlns:wpi="http://schemas.microsoft.com/office/word/2010/wordprocessingInk" xmlns:wne="http://schemas.microsoft.com/office/word/2006/wordml" xmlns:wps="http://schemas.microsoft.com/office/word/2010/wordprocessingShape" mc:Ignorable="w14 w15 w16se w16cid w16 w16cex w16sdtdh w16sdtfl w16du wp14">
+<w:document xmlns:wpc="http://schemas.microsoft.com/office/word/2010/wordprocessingCanvas" xmlns:cx="http://schemas.microsoft.com/office/drawing/2014/chartex" xmlns:mc="http://schemas.openxmlformats.org/markup-compatibility/2006" xmlns:o="urn:schemas-microsoft-com:office:office" xmlns:r="http://schemas.openxmlformats.org/officeDocument/2006/relationships" xmlns:m="http://schemas.openxmlformats.org/officeDocument/2006/math" xmlns:v="urn:schemas-microsoft-com:vml" xmlns:wp14="http://schemas.microsoft.com/office/word/2010/wordprocessingDrawing" xmlns:wp="http://schemas.openxmlformats.org/drawingml/2006/wordprocessingDrawing" xmlns:w10="urn:schemas-microsoft-com:office:word" xmlns:w="http://schemas.openxmlformats.org/wordprocessingml/2006/main" xmlns:w14="http://schemas.microsoft.com/office/word/2010/wordml" xmlns:w15="http://schemas.microsoft.com/office/word/2012/wordml" xmlns:w16se="http://schemas.microsoft.com/office/word/2015/wordml/symex" xmlns:wpg="http://schemas.microsoft.com/office/word/2010/wordprocessingGroup" xmlns:wpi="http://schemas.microsoft.com/office/word/2010/wordprocessingInk" xmlns:wne="http://schemas.microsoft.com/office/word/2006/wordml" xmlns:wps="http://schemas.microsoft.com/office/word/2010/wordprocessingShape" mc:Ignorable="w14 w15 w16se wp14">
   <w:body>
     <w:sdt>
       <w:sdtPr>
@@ -339,7 +339,7 @@
                   </wp:anchor>
                 </w:drawing>
               </mc:Choice>
-              <mc:Fallback>
+              <mc:Fallback xmlns:w16sdtfl="http://schemas.microsoft.com/office/word/2024/wordml/sdtformatlock" xmlns:w16sdtdh="http://schemas.microsoft.com/office/word/2020/wordml/sdtdatahash" xmlns:w16du="http://schemas.microsoft.com/office/word/2023/wordml/word16du" xmlns:w16="http://schemas.microsoft.com/office/word/2018/wordml" xmlns:w16cid="http://schemas.microsoft.com/office/word/2016/wordml/cid" xmlns:w16cex="http://schemas.microsoft.com/office/word/2018/wordml/cex" xmlns:oel="http://schemas.microsoft.com/office/2019/extlst" xmlns:am3d="http://schemas.microsoft.com/office/drawing/2017/model3d" xmlns:aink="http://schemas.microsoft.com/office/drawing/2016/ink" xmlns:cx8="http://schemas.microsoft.com/office/drawing/2016/5/14/chartex" xmlns:cx7="http://schemas.microsoft.com/office/drawing/2016/5/13/chartex" xmlns:cx6="http://schemas.microsoft.com/office/drawing/2016/5/12/chartex" xmlns:cx5="http://schemas.microsoft.com/office/drawing/2016/5/11/chartex" xmlns:cx4="http://schemas.microsoft.com/office/drawing/2016/5/10/chartex" xmlns:cx3="http://schemas.microsoft.com/office/drawing/2016/5/9/chartex" xmlns:cx2="http://schemas.microsoft.com/office/drawing/2015/10/21/chartex" xmlns:cx1="http://schemas.microsoft.com/office/drawing/2015/9/8/chartex">
                 <w:pict>
                   <v:group w14:anchorId="76B26908" id="Group 157" o:spid="_x0000_s1026" style="position:absolute;margin-left:0;margin-top:0;width:8in;height:95.7pt;z-index:251662336;mso-width-percent:941;mso-height-percent:121;mso-top-percent:23;mso-position-horizontal:center;mso-position-horizontal-relative:page;mso-position-vertical-relative:page;mso-width-percent:941;mso-height-percent:121;mso-top-percent:23" coordorigin="" coordsize="73152,12161" o:gfxdata="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">
                     <v:shape id="Rectangle 51" o:spid="_x0000_s1027" style="position:absolute;width:73152;height:11303;visibility:visible;mso-wrap-style:square;v-text-anchor:middle" coordsize="7312660,1129665" o:gfxdata="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" path="m,l7312660,r,1129665l3619500,733425,,1091565,,xe" fillcolor="#156082 [3204]" stroked="f" strokeweight="1pt">
@@ -458,7 +458,7 @@
                   </wp:anchor>
                 </w:drawing>
               </mc:Choice>
-              <mc:Fallback>
+              <mc:Fallback xmlns:w16sdtfl="http://schemas.microsoft.com/office/word/2024/wordml/sdtformatlock" xmlns:w16sdtdh="http://schemas.microsoft.com/office/word/2020/wordml/sdtdatahash" xmlns:w16du="http://schemas.microsoft.com/office/word/2023/wordml/word16du" xmlns:w16="http://schemas.microsoft.com/office/word/2018/wordml" xmlns:w16cid="http://schemas.microsoft.com/office/word/2016/wordml/cid" xmlns:w16cex="http://schemas.microsoft.com/office/word/2018/wordml/cex" xmlns:oel="http://schemas.microsoft.com/office/2019/extlst" xmlns:am3d="http://schemas.microsoft.com/office/drawing/2017/model3d" xmlns:aink="http://schemas.microsoft.com/office/drawing/2016/ink" xmlns:cx8="http://schemas.microsoft.com/office/drawing/2016/5/14/chartex" xmlns:cx7="http://schemas.microsoft.com/office/drawing/2016/5/13/chartex" xmlns:cx6="http://schemas.microsoft.com/office/drawing/2016/5/12/chartex" xmlns:cx5="http://schemas.microsoft.com/office/drawing/2016/5/11/chartex" xmlns:cx4="http://schemas.microsoft.com/office/drawing/2016/5/10/chartex" xmlns:cx3="http://schemas.microsoft.com/office/drawing/2016/5/9/chartex" xmlns:cx2="http://schemas.microsoft.com/office/drawing/2015/10/21/chartex" xmlns:cx1="http://schemas.microsoft.com/office/drawing/2015/9/8/chartex">
                 <w:pict>
                   <v:shapetype w14:anchorId="7DAA5BE9" id="_x0000_t202" coordsize="21600,21600" o:spt="202" path="m,l,21600r21600,l21600,xe">
                     <v:stroke joinstyle="miter"/>
@@ -587,7 +587,7 @@
                   </wp:anchor>
                 </w:drawing>
               </mc:Choice>
-              <mc:Fallback>
+              <mc:Fallback xmlns:w16sdtfl="http://schemas.microsoft.com/office/word/2024/wordml/sdtformatlock" xmlns:w16sdtdh="http://schemas.microsoft.com/office/word/2020/wordml/sdtdatahash" xmlns:w16du="http://schemas.microsoft.com/office/word/2023/wordml/word16du" xmlns:w16="http://schemas.microsoft.com/office/word/2018/wordml" xmlns:w16cid="http://schemas.microsoft.com/office/word/2016/wordml/cid" xmlns:w16cex="http://schemas.microsoft.com/office/word/2018/wordml/cex" xmlns:oel="http://schemas.microsoft.com/office/2019/extlst" xmlns:am3d="http://schemas.microsoft.com/office/drawing/2017/model3d" xmlns:aink="http://schemas.microsoft.com/office/drawing/2016/ink" xmlns:cx8="http://schemas.microsoft.com/office/drawing/2016/5/14/chartex" xmlns:cx7="http://schemas.microsoft.com/office/drawing/2016/5/13/chartex" xmlns:cx6="http://schemas.microsoft.com/office/drawing/2016/5/12/chartex" xmlns:cx5="http://schemas.microsoft.com/office/drawing/2016/5/11/chartex" xmlns:cx4="http://schemas.microsoft.com/office/drawing/2016/5/10/chartex" xmlns:cx3="http://schemas.microsoft.com/office/drawing/2016/5/9/chartex" xmlns:cx2="http://schemas.microsoft.com/office/drawing/2015/10/21/chartex" xmlns:cx1="http://schemas.microsoft.com/office/drawing/2015/9/8/chartex">
                 <w:pict>
                   <v:shape w14:anchorId="0F5C3210" id="_x0000_s1027" type="#_x0000_t202" style="position:absolute;margin-left:0;margin-top:161.8pt;width:340.95pt;height:40.3pt;z-index:251668480;visibility:visible;mso-wrap-style:square;mso-width-percent:0;mso-height-percent:0;mso-wrap-distance-left:9pt;mso-wrap-distance-top:3.6pt;mso-wrap-distance-right:9pt;mso-wrap-distance-bottom:3.6pt;mso-position-horizontal:center;mso-position-horizontal-relative:margin;mso-position-vertical:absolute;mso-position-vertical-relative:text;mso-width-percent:0;mso-height-percent:0;mso-width-relative:margin;mso-height-relative:margin;v-text-anchor:top" o:gfxdata="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" stroked="f">
                     <v:textbox>
@@ -694,7 +694,7 @@
                   </wp:anchor>
                 </w:drawing>
               </mc:Choice>
-              <mc:Fallback>
+              <mc:Fallback xmlns:w16sdtfl="http://schemas.microsoft.com/office/word/2024/wordml/sdtformatlock" xmlns:w16sdtdh="http://schemas.microsoft.com/office/word/2020/wordml/sdtdatahash" xmlns:w16du="http://schemas.microsoft.com/office/word/2023/wordml/word16du" xmlns:w16="http://schemas.microsoft.com/office/word/2018/wordml" xmlns:w16cid="http://schemas.microsoft.com/office/word/2016/wordml/cid" xmlns:w16cex="http://schemas.microsoft.com/office/word/2018/wordml/cex" xmlns:oel="http://schemas.microsoft.com/office/2019/extlst" xmlns:am3d="http://schemas.microsoft.com/office/drawing/2017/model3d" xmlns:aink="http://schemas.microsoft.com/office/drawing/2016/ink" xmlns:cx8="http://schemas.microsoft.com/office/drawing/2016/5/14/chartex" xmlns:cx7="http://schemas.microsoft.com/office/drawing/2016/5/13/chartex" xmlns:cx6="http://schemas.microsoft.com/office/drawing/2016/5/12/chartex" xmlns:cx5="http://schemas.microsoft.com/office/drawing/2016/5/11/chartex" xmlns:cx4="http://schemas.microsoft.com/office/drawing/2016/5/10/chartex" xmlns:cx3="http://schemas.microsoft.com/office/drawing/2016/5/9/chartex" xmlns:cx2="http://schemas.microsoft.com/office/drawing/2015/10/21/chartex" xmlns:cx1="http://schemas.microsoft.com/office/drawing/2015/9/8/chartex">
                 <w:pict>
                   <v:shape w14:anchorId="766A804C" id="Text Box 20" o:spid="_x0000_s1028" type="#_x0000_t202" style="position:absolute;margin-left:0;margin-top:201.4pt;width:78.9pt;height:34pt;z-index:251666432;visibility:visible;mso-wrap-style:square;mso-width-percent:0;mso-wrap-distance-left:9pt;mso-wrap-distance-top:0;mso-wrap-distance-right:9pt;mso-wrap-distance-bottom:0;mso-position-horizontal:center;mso-position-horizontal-relative:margin;mso-position-vertical:absolute;mso-position-vertical-relative:text;mso-width-percent:0;mso-width-relative:margin;v-text-anchor:top" o:gfxdata="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" fillcolor="white [3201]" stroked="f" strokeweight=".5pt">
                     <v:textbox>
@@ -1856,7 +1856,11 @@
               </mc:Choice>
               <mc:Fallback>
                 <w:pict>
-                  <v:shape w14:anchorId="436E1113" id="Text Box 163" o:spid="_x0000_s1029" type="#_x0000_t202" style="position:absolute;margin-left:0;margin-top:335.4pt;width:8in;height:286.5pt;z-index:251659264;visibility:visible;mso-wrap-style:square;mso-width-percent:941;mso-height-percent:363;mso-wrap-distance-left:9pt;mso-wrap-distance-top:0;mso-wrap-distance-right:9pt;mso-wrap-distance-bottom:0;mso-position-horizontal:center;mso-position-horizontal-relative:margin;mso-position-vertical:absolute;mso-position-vertical-relative:page;mso-width-percent:941;mso-height-percent:363;mso-width-relative:page;mso-height-relative:page;v-text-anchor:bottom" o:gfxdata="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" filled="f" stroked="f" strokeweight=".5pt">
+                  <v:shapetype w14:anchorId="436E1113" id="_x0000_t202" coordsize="21600,21600" o:spt="202" path="m,l,21600r21600,l21600,xe">
+                    <v:stroke joinstyle="miter"/>
+                    <v:path gradientshapeok="t" o:connecttype="rect"/>
+                  </v:shapetype>
+                  <v:shape id="Text Box 163" o:spid="_x0000_s1029" type="#_x0000_t202" style="position:absolute;margin-left:0;margin-top:335.4pt;width:8in;height:286.5pt;z-index:251659264;visibility:visible;mso-wrap-style:square;mso-width-percent:941;mso-height-percent:363;mso-wrap-distance-left:9pt;mso-wrap-distance-top:0;mso-wrap-distance-right:9pt;mso-wrap-distance-bottom:0;mso-position-horizontal:center;mso-position-horizontal-relative:margin;mso-position-vertical:absolute;mso-position-vertical-relative:page;mso-width-percent:941;mso-height-percent:363;mso-width-relative:page;mso-height-relative:page;v-text-anchor:bottom" o:gfxdata="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" filled="f" stroked="f" strokeweight=".5pt">
                     <v:textbox inset="126pt,0,54pt,0">
                       <w:txbxContent>
                         <w:p>
@@ -4070,69 +4074,8 @@
         </w:numPr>
         <w:jc w:val="both"/>
       </w:pPr>
-      <w:proofErr w:type="spellStart"/>
-      <w:r>
-        <w:t>LoadMemberData</w:t>
-      </w:r>
-      <w:proofErr w:type="spellEnd"/>
-      <w:r>
-        <w:t>(),</w:t>
-      </w:r>
-      <w:proofErr w:type="spellStart"/>
-      <w:r>
-        <w:t>LoadPhoneData</w:t>
-      </w:r>
-      <w:proofErr w:type="spellEnd"/>
-      <w:r>
-        <w:t xml:space="preserve">(int </w:t>
-      </w:r>
-      <w:proofErr w:type="spellStart"/>
-      <w:r>
-        <w:t>memberId</w:t>
-      </w:r>
-      <w:proofErr w:type="spellEnd"/>
-      <w:r>
-        <w:t xml:space="preserve"> = -1), </w:t>
-      </w:r>
-      <w:proofErr w:type="spellStart"/>
-      <w:r>
-        <w:t>LoadMembershipOptions</w:t>
-      </w:r>
-      <w:proofErr w:type="spellEnd"/>
-      <w:r>
-        <w:t xml:space="preserve">(), </w:t>
-      </w:r>
-      <w:proofErr w:type="spellStart"/>
-      <w:r>
-        <w:t>LoadBranchOptions</w:t>
-      </w:r>
-      <w:proofErr w:type="spellEnd"/>
-      <w:r>
-        <w:t xml:space="preserve">(), </w:t>
-      </w:r>
-      <w:proofErr w:type="spellStart"/>
-      <w:r>
-        <w:t>LoadPlanOptions</w:t>
-      </w:r>
-      <w:proofErr w:type="spellEnd"/>
-      <w:r>
-        <w:t xml:space="preserve">(), </w:t>
-      </w:r>
-      <w:proofErr w:type="spellStart"/>
-      <w:r>
-        <w:t>SetupGenderComboBox</w:t>
-      </w:r>
-      <w:proofErr w:type="spellEnd"/>
-      <w:r>
-        <w:t xml:space="preserve">(), </w:t>
-      </w:r>
-      <w:proofErr w:type="spellStart"/>
-      <w:r>
-        <w:t>ClearFields</w:t>
-      </w:r>
-      <w:proofErr w:type="spellEnd"/>
-      <w:r>
-        <w:t>()</w:t>
+      <w:r>
+        <w:t>LoadMemberData(),LoadPhoneData(int memberId = -1), LoadMembershipOptions(), LoadBranchOptions(), LoadPlanOptions(), SetupGenderComboBox(), ClearFields()</w:t>
       </w:r>
     </w:p>
     <w:p>
@@ -4159,51 +4102,9 @@
         </w:numPr>
         <w:jc w:val="both"/>
       </w:pPr>
-      <w:proofErr w:type="spellStart"/>
-      <w:r>
-        <w:t>Add_Member_Click</w:t>
-      </w:r>
-      <w:proofErr w:type="spellEnd"/>
-      <w:r>
-        <w:t xml:space="preserve">, </w:t>
-      </w:r>
-      <w:proofErr w:type="spellStart"/>
-      <w:r>
-        <w:t>Delete_Member_Click</w:t>
-      </w:r>
-      <w:proofErr w:type="spellEnd"/>
-      <w:r>
-        <w:t xml:space="preserve">, </w:t>
-      </w:r>
-      <w:proofErr w:type="spellStart"/>
-      <w:r>
-        <w:t>Search_Click</w:t>
-      </w:r>
-      <w:proofErr w:type="spellEnd"/>
-      <w:r>
-        <w:t xml:space="preserve">, </w:t>
-      </w:r>
-      <w:proofErr w:type="spellStart"/>
-      <w:r>
-        <w:t>Add_Phone_Click</w:t>
-      </w:r>
-      <w:proofErr w:type="spellEnd"/>
-      <w:r>
-        <w:t xml:space="preserve">, </w:t>
-      </w:r>
-      <w:proofErr w:type="spellStart"/>
-      <w:r>
-        <w:t>btnNoPlan_Click</w:t>
-      </w:r>
-      <w:proofErr w:type="spellEnd"/>
-      <w:r>
-        <w:t xml:space="preserve">, comboBox1_SelectedIndexChanged, dataGridView1_CellClick, </w:t>
-      </w:r>
-      <w:proofErr w:type="spellStart"/>
-      <w:r>
-        <w:t>Back_Click</w:t>
-      </w:r>
-      <w:proofErr w:type="spellEnd"/>
+      <w:r>
+        <w:t>Add_Member_Click, Delete_Member_Click, Search_Click, Add_Phone_Click, btnNoPlan_Click, comboBox1_SelectedIndexChanged, dataGridView1_CellClick, Back_Click</w:t>
+      </w:r>
     </w:p>
     <w:p>
       <w:pPr>
@@ -4714,7 +4615,6 @@
           <w:b/>
           <w:bCs/>
         </w:rPr>
-        <w:lastRenderedPageBreak/>
         <w:t>Functionalities:</w:t>
       </w:r>
     </w:p>
@@ -4726,6 +4626,7 @@
         </w:numPr>
       </w:pPr>
       <w:r>
+        <w:lastRenderedPageBreak/>
         <w:t>Add a new class by entering a Class Name and selecting a Trainer.</w:t>
       </w:r>
     </w:p>
@@ -4849,16 +4750,168 @@
         <w:t>.</w:t>
       </w:r>
     </w:p>
+    <w:p>
+      <w:pPr>
+        <w:rPr>
+          <w:b/>
+          <w:bCs/>
+        </w:rPr>
+      </w:pPr>
+      <w:r>
+        <w:rPr>
+          <w:b/>
+          <w:bCs/>
+        </w:rPr>
+        <w:t xml:space="preserve">Procedures used: </w:t>
+      </w:r>
+    </w:p>
+    <w:p>
+      <w:pPr>
+        <w:pStyle w:val="ListParagraph"/>
+        <w:numPr>
+          <w:ilvl w:val="0"/>
+          <w:numId w:val="12"/>
+        </w:numPr>
+        <w:spacing w:line="360" w:lineRule="auto"/>
+      </w:pPr>
+      <w:r>
+        <w:rPr>
+          <w:b/>
+          <w:bCs/>
+        </w:rPr>
+        <w:t>Constructor Procedure</w:t>
+      </w:r>
+      <w:r>
+        <w:t xml:space="preserve">  </w:t>
+      </w:r>
+      <w:r>
+        <w:t>public ClassScheduler()</w:t>
+      </w:r>
+    </w:p>
+    <w:p>
+      <w:pPr>
+        <w:pStyle w:val="ListParagraph"/>
+        <w:numPr>
+          <w:ilvl w:val="0"/>
+          <w:numId w:val="12"/>
+        </w:numPr>
+        <w:spacing w:line="360" w:lineRule="auto"/>
+      </w:pPr>
+      <w:r>
+        <w:rPr>
+          <w:b/>
+          <w:bCs/>
+        </w:rPr>
+        <w:t>Data Loading Procedures</w:t>
+      </w:r>
+      <w:r>
+        <w:rPr>
+          <w:b/>
+          <w:bCs/>
+        </w:rPr>
+        <w:t xml:space="preserve">  </w:t>
+      </w:r>
+      <w:r>
+        <w:t>LoadClassData();</w:t>
+      </w:r>
+      <w:r>
+        <w:t xml:space="preserve">  </w:t>
+      </w:r>
+      <w:r>
+        <w:t>LoadScheduleData();</w:t>
+      </w:r>
+      <w:r>
+        <w:t xml:space="preserve">  </w:t>
+      </w:r>
+      <w:r>
+        <w:t>LoadTrainerComboBox();</w:t>
+      </w:r>
+      <w:r>
+        <w:t xml:space="preserve">  </w:t>
+      </w:r>
+      <w:r>
+        <w:t>LoadDayComboBox();</w:t>
+      </w:r>
+    </w:p>
+    <w:p>
+      <w:pPr>
+        <w:pStyle w:val="ListParagraph"/>
+        <w:numPr>
+          <w:ilvl w:val="0"/>
+          <w:numId w:val="12"/>
+        </w:numPr>
+        <w:spacing w:line="360" w:lineRule="auto"/>
+      </w:pPr>
+      <w:r>
+        <w:rPr>
+          <w:b/>
+          <w:bCs/>
+        </w:rPr>
+        <w:t>Event Procedures</w:t>
+      </w:r>
+      <w:r>
+        <w:t xml:space="preserve"> </w:t>
+      </w:r>
+      <w:r>
+        <w:t>btnAddClass.Click</w:t>
+      </w:r>
+      <w:r>
+        <w:t xml:space="preserve">;  </w:t>
+      </w:r>
+      <w:r>
+        <w:t>btnUpdateClass.Click</w:t>
+      </w:r>
+      <w:r>
+        <w:t xml:space="preserve">;  </w:t>
+      </w:r>
+      <w:r>
+        <w:t>btnDeleteClass.Click</w:t>
+      </w:r>
+      <w:r>
+        <w:t xml:space="preserve">;  </w:t>
+      </w:r>
+      <w:r>
+        <w:t>dgvSchedules.CellClick</w:t>
+      </w:r>
+      <w:r>
+        <w:t xml:space="preserve">;  </w:t>
+      </w:r>
+      <w:r>
+        <w:t>dgvClasses.CellClick</w:t>
+      </w:r>
+      <w:r>
+        <w:t xml:space="preserve">;  </w:t>
+      </w:r>
+      <w:r>
+        <w:t>btnClear.Click</w:t>
+      </w:r>
+      <w:r>
+        <w:t>;</w:t>
+      </w:r>
+    </w:p>
     <w:p/>
+    <w:p/>
+    <w:p/>
+    <w:p/>
+    <w:p/>
+    <w:p/>
+    <w:p/>
+    <w:p/>
+    <w:p/>
+    <w:p>
+      <w:bookmarkStart w:id="5" w:name="_GoBack"/>
+      <w:bookmarkEnd w:id="5"/>
+    </w:p>
     <w:p>
       <w:pPr>
         <w:pStyle w:val="Heading2"/>
       </w:pPr>
-      <w:bookmarkStart w:id="5" w:name="_Toc229058399"/>
-      <w:r>
+      <w:bookmarkStart w:id="6" w:name="_Toc229058399"/>
+      <w:r>
+        <w:lastRenderedPageBreak/>
         <w:t>Membership Management</w:t>
       </w:r>
-      <w:bookmarkEnd w:id="5"/>
+      <w:bookmarkEnd w:id="6"/>
     </w:p>
     <w:p>
       <w:r>
@@ -4881,7 +4934,6 @@
         <w:rPr>
           <w:noProof/>
         </w:rPr>
-        <w:lastRenderedPageBreak/>
         <w:drawing>
           <wp:inline distT="0" distB="0" distL="0" distR="0" wp14:anchorId="618CD822" wp14:editId="043FE26E">
             <wp:extent cx="5151229" cy="3723640"/>
@@ -5085,6 +5137,7 @@
           <w:b/>
           <w:bCs/>
         </w:rPr>
+        <w:lastRenderedPageBreak/>
         <w:t>1. Constructor Procedure</w:t>
       </w:r>
     </w:p>
@@ -5111,7 +5164,6 @@
           <w:b/>
           <w:bCs/>
         </w:rPr>
-        <w:lastRenderedPageBreak/>
         <w:t>2. Data Loading Procedures</w:t>
       </w:r>
     </w:p>
@@ -5122,61 +5174,8 @@
           <w:numId w:val="10"/>
         </w:numPr>
       </w:pPr>
-      <w:proofErr w:type="spellStart"/>
-      <w:r>
-        <w:t>LoadMembershipData</w:t>
-      </w:r>
-      <w:proofErr w:type="spellEnd"/>
-      <w:r>
-        <w:t xml:space="preserve">(), </w:t>
-      </w:r>
-      <w:proofErr w:type="spellStart"/>
-      <w:r>
-        <w:t>SetupDurationComboBox</w:t>
-      </w:r>
-      <w:proofErr w:type="spellEnd"/>
-      <w:r>
-        <w:t xml:space="preserve">(), </w:t>
-      </w:r>
-      <w:proofErr w:type="spellStart"/>
-      <w:r>
-        <w:t>ClearFields</w:t>
-      </w:r>
-      <w:proofErr w:type="spellEnd"/>
-      <w:r>
-        <w:t xml:space="preserve">(), </w:t>
-      </w:r>
-      <w:proofErr w:type="spellStart"/>
-      <w:r>
-        <w:t>StyleDataGridView</w:t>
-      </w:r>
-      <w:proofErr w:type="spellEnd"/>
-      <w:r>
-        <w:t xml:space="preserve">(), </w:t>
-      </w:r>
-      <w:proofErr w:type="spellStart"/>
-      <w:r>
-        <w:t>ApplyStyle</w:t>
-      </w:r>
-      <w:proofErr w:type="spellEnd"/>
-      <w:r>
-        <w:t>(</w:t>
-      </w:r>
-      <w:proofErr w:type="spellStart"/>
-      <w:r>
-        <w:t>DataGridView</w:t>
-      </w:r>
-      <w:proofErr w:type="spellEnd"/>
-      <w:r>
-        <w:t xml:space="preserve"> </w:t>
-      </w:r>
-      <w:proofErr w:type="spellStart"/>
-      <w:r>
-        <w:t>dgv</w:t>
-      </w:r>
-      <w:proofErr w:type="spellEnd"/>
-      <w:r>
-        <w:t>)</w:t>
+      <w:r>
+        <w:t>LoadMembershipData(), SetupDurationComboBox(), ClearFields(), StyleDataGridView(), ApplyStyle(DataGridView dgv)</w:t>
       </w:r>
     </w:p>
     <w:p>
@@ -5202,39 +5201,7 @@
         </w:numPr>
       </w:pPr>
       <w:r>
-        <w:t xml:space="preserve">Add_MemberShip_Click, </w:t>
-      </w:r>
-      <w:proofErr w:type="spellStart"/>
-      <w:r>
-        <w:t>Update_MemberShip_Click</w:t>
-      </w:r>
-      <w:proofErr w:type="spellEnd"/>
-      <w:r>
-        <w:t xml:space="preserve">, </w:t>
-      </w:r>
-      <w:proofErr w:type="spellStart"/>
-      <w:r>
-        <w:t>Delete_MemberShip_Click</w:t>
-      </w:r>
-      <w:proofErr w:type="spellEnd"/>
-      <w:r>
-        <w:t xml:space="preserve">, </w:t>
-      </w:r>
-      <w:proofErr w:type="spellStart"/>
-      <w:r>
-        <w:t>Search_Click</w:t>
-      </w:r>
-      <w:proofErr w:type="spellEnd"/>
-      <w:r>
-        <w:t xml:space="preserve">, </w:t>
-      </w:r>
-      <w:proofErr w:type="spellStart"/>
-      <w:r>
-        <w:t>Back_Click</w:t>
-      </w:r>
-      <w:proofErr w:type="spellEnd"/>
-      <w:r>
-        <w:t>, dataGridView1_CellClick</w:t>
+        <w:t>Add_MemberShip_Click, Update_MemberShip_Click, Delete_MemberShip_Click, Search_Click, Back_Click, dataGridView1_CellClick</w:t>
       </w:r>
     </w:p>
     <w:p/>
@@ -5242,11 +5209,11 @@
       <w:pPr>
         <w:pStyle w:val="Heading2"/>
       </w:pPr>
-      <w:bookmarkStart w:id="6" w:name="_Toc229058400"/>
+      <w:bookmarkStart w:id="7" w:name="_Toc229058400"/>
       <w:r>
         <w:t>Branch Management</w:t>
       </w:r>
-      <w:bookmarkEnd w:id="6"/>
+      <w:bookmarkEnd w:id="7"/>
     </w:p>
     <w:p>
       <w:r>
@@ -5389,6 +5356,7 @@
         </w:numPr>
       </w:pPr>
       <w:r>
+        <w:lastRenderedPageBreak/>
         <w:t>The Equipment grid shows all equipment assigned to branches (ID, Name, Purchase Date, Maintenance Duration, Branch_ID).</w:t>
       </w:r>
     </w:p>
@@ -5400,7 +5368,6 @@
         </w:numPr>
       </w:pPr>
       <w:r>
-        <w:lastRenderedPageBreak/>
         <w:t>Add, update, and delete equipment records directly from this form using the panel on the right side.</w:t>
       </w:r>
     </w:p>
@@ -5667,11 +5634,11 @@
       <w:pPr>
         <w:pStyle w:val="Heading1"/>
       </w:pPr>
-      <w:bookmarkStart w:id="7" w:name="_Toc229058401"/>
+      <w:bookmarkStart w:id="8" w:name="_Toc229058401"/>
       <w:r>
         <w:t>UI Flow</w:t>
       </w:r>
-      <w:bookmarkEnd w:id="7"/>
+      <w:bookmarkEnd w:id="8"/>
       <w:r>
         <w:t xml:space="preserve"> </w:t>
       </w:r>
@@ -5750,7 +5717,7 @@
 </file>
 
 <file path=word/endnotes.xml><?xml version="1.0" encoding="utf-8"?>
-<w:endnotes xmlns:wpc="http://schemas.microsoft.com/office/word/2010/wordprocessingCanvas" xmlns:cx="http://schemas.microsoft.com/office/drawing/2014/chartex" xmlns:cx1="http://schemas.microsoft.com/office/drawing/2015/9/8/chartex" xmlns:cx2="http://schemas.microsoft.com/office/drawing/2015/10/21/chartex" xmlns:cx3="http://schemas.microsoft.com/office/drawing/2016/5/9/chartex" xmlns:cx4="http://schemas.microsoft.com/office/drawing/2016/5/10/chartex" xmlns:cx5="http://schemas.microsoft.com/office/drawing/2016/5/11/chartex" xmlns:cx6="http://schemas.microsoft.com/office/drawing/2016/5/12/chartex" xmlns:cx7="http://schemas.microsoft.com/office/drawing/2016/5/13/chartex" xmlns:cx8="http://schemas.microsoft.com/office/drawing/2016/5/14/chartex" xmlns:mc="http://schemas.openxmlformats.org/markup-compatibility/2006" xmlns:aink="http://schemas.microsoft.com/office/drawing/2016/ink" xmlns:am3d="http://schemas.microsoft.com/office/drawing/2017/model3d" xmlns:o="urn:schemas-microsoft-com:office:office" xmlns:oel="http://schemas.microsoft.com/office/2019/extlst" xmlns:r="http://schemas.openxmlformats.org/officeDocument/2006/relationships" xmlns:m="http://schemas.openxmlformats.org/officeDocument/2006/math" xmlns:v="urn:schemas-microsoft-com:vml" xmlns:wp14="http://schemas.microsoft.com/office/word/2010/wordprocessingDrawing" xmlns:wp="http://schemas.openxmlformats.org/drawingml/2006/wordprocessingDrawing" xmlns:w10="urn:schemas-microsoft-com:office:word" xmlns:w="http://schemas.openxmlformats.org/wordprocessingml/2006/main" xmlns:w14="http://schemas.microsoft.com/office/word/2010/wordml" xmlns:w15="http://schemas.microsoft.com/office/word/2012/wordml" xmlns:w16cex="http://schemas.microsoft.com/office/word/2018/wordml/cex" xmlns:w16cid="http://schemas.microsoft.com/office/word/2016/wordml/cid" xmlns:w16="http://schemas.microsoft.com/office/word/2018/wordml" xmlns:w16du="http://schemas.microsoft.com/office/word/2023/wordml/word16du" xmlns:w16sdtdh="http://schemas.microsoft.com/office/word/2020/wordml/sdtdatahash" xmlns:w16sdtfl="http://schemas.microsoft.com/office/word/2024/wordml/sdtformatlock" xmlns:w16se="http://schemas.microsoft.com/office/word/2015/wordml/symex" xmlns:wpg="http://schemas.microsoft.com/office/word/2010/wordprocessingGroup" xmlns:wpi="http://schemas.microsoft.com/office/word/2010/wordprocessingInk" xmlns:wne="http://schemas.microsoft.com/office/word/2006/wordml" xmlns:wps="http://schemas.microsoft.com/office/word/2010/wordprocessingShape" mc:Ignorable="w14 w15 w16se w16cid w16 w16cex w16sdtdh w16sdtfl w16du wp14">
+<w:endnotes xmlns:wpc="http://schemas.microsoft.com/office/word/2010/wordprocessingCanvas" xmlns:cx="http://schemas.microsoft.com/office/drawing/2014/chartex" xmlns:mc="http://schemas.openxmlformats.org/markup-compatibility/2006" xmlns:o="urn:schemas-microsoft-com:office:office" xmlns:r="http://schemas.openxmlformats.org/officeDocument/2006/relationships" xmlns:m="http://schemas.openxmlformats.org/officeDocument/2006/math" xmlns:v="urn:schemas-microsoft-com:vml" xmlns:wp14="http://schemas.microsoft.com/office/word/2010/wordprocessingDrawing" xmlns:wp="http://schemas.openxmlformats.org/drawingml/2006/wordprocessingDrawing" xmlns:w10="urn:schemas-microsoft-com:office:word" xmlns:w="http://schemas.openxmlformats.org/wordprocessingml/2006/main" xmlns:w14="http://schemas.microsoft.com/office/word/2010/wordml" xmlns:w15="http://schemas.microsoft.com/office/word/2012/wordml" xmlns:w16se="http://schemas.microsoft.com/office/word/2015/wordml/symex" xmlns:wpg="http://schemas.microsoft.com/office/word/2010/wordprocessingGroup" xmlns:wpi="http://schemas.microsoft.com/office/word/2010/wordprocessingInk" xmlns:wne="http://schemas.microsoft.com/office/word/2006/wordml" xmlns:wps="http://schemas.microsoft.com/office/word/2010/wordprocessingShape" mc:Ignorable="w14 w15 w16se wp14">
   <w:endnote w:type="separator" w:id="-1">
     <w:p>
       <w:pPr>
@@ -5775,7 +5742,7 @@
 </file>
 
 <file path=word/footer1.xml><?xml version="1.0" encoding="utf-8"?>
-<w:ftr xmlns:wpc="http://schemas.microsoft.com/office/word/2010/wordprocessingCanvas" xmlns:cx="http://schemas.microsoft.com/office/drawing/2014/chartex" xmlns:cx1="http://schemas.microsoft.com/office/drawing/2015/9/8/chartex" xmlns:cx2="http://schemas.microsoft.com/office/drawing/2015/10/21/chartex" xmlns:cx3="http://schemas.microsoft.com/office/drawing/2016/5/9/chartex" xmlns:cx4="http://schemas.microsoft.com/office/drawing/2016/5/10/chartex" xmlns:cx5="http://schemas.microsoft.com/office/drawing/2016/5/11/chartex" xmlns:cx6="http://schemas.microsoft.com/office/drawing/2016/5/12/chartex" xmlns:cx7="http://schemas.microsoft.com/office/drawing/2016/5/13/chartex" xmlns:cx8="http://schemas.microsoft.com/office/drawing/2016/5/14/chartex" xmlns:mc="http://schemas.openxmlformats.org/markup-compatibility/2006" xmlns:aink="http://schemas.microsoft.com/office/drawing/2016/ink" xmlns:am3d="http://schemas.microsoft.com/office/drawing/2017/model3d" xmlns:o="urn:schemas-microsoft-com:office:office" xmlns:oel="http://schemas.microsoft.com/office/2019/extlst" xmlns:r="http://schemas.openxmlformats.org/officeDocument/2006/relationships" xmlns:m="http://schemas.openxmlformats.org/officeDocument/2006/math" xmlns:v="urn:schemas-microsoft-com:vml" xmlns:wp14="http://schemas.microsoft.com/office/word/2010/wordprocessingDrawing" xmlns:wp="http://schemas.openxmlformats.org/drawingml/2006/wordprocessingDrawing" xmlns:w10="urn:schemas-microsoft-com:office:word" xmlns:w="http://schemas.openxmlformats.org/wordprocessingml/2006/main" xmlns:w14="http://schemas.microsoft.com/office/word/2010/wordml" xmlns:w15="http://schemas.microsoft.com/office/word/2012/wordml" xmlns:w16cex="http://schemas.microsoft.com/office/word/2018/wordml/cex" xmlns:w16cid="http://schemas.microsoft.com/office/word/2016/wordml/cid" xmlns:w16="http://schemas.microsoft.com/office/word/2018/wordml" xmlns:w16du="http://schemas.microsoft.com/office/word/2023/wordml/word16du" xmlns:w16sdtdh="http://schemas.microsoft.com/office/word/2020/wordml/sdtdatahash" xmlns:w16sdtfl="http://schemas.microsoft.com/office/word/2024/wordml/sdtformatlock" xmlns:w16se="http://schemas.microsoft.com/office/word/2015/wordml/symex" xmlns:wpg="http://schemas.microsoft.com/office/word/2010/wordprocessingGroup" xmlns:wpi="http://schemas.microsoft.com/office/word/2010/wordprocessingInk" xmlns:wne="http://schemas.microsoft.com/office/word/2006/wordml" xmlns:wps="http://schemas.microsoft.com/office/word/2010/wordprocessingShape" mc:Ignorable="w14 w15 w16se w16cid w16 w16cex w16sdtdh w16sdtfl w16du wp14">
+<w:ftr xmlns:wpc="http://schemas.microsoft.com/office/word/2010/wordprocessingCanvas" xmlns:cx="http://schemas.microsoft.com/office/drawing/2014/chartex" xmlns:mc="http://schemas.openxmlformats.org/markup-compatibility/2006" xmlns:o="urn:schemas-microsoft-com:office:office" xmlns:r="http://schemas.openxmlformats.org/officeDocument/2006/relationships" xmlns:m="http://schemas.openxmlformats.org/officeDocument/2006/math" xmlns:v="urn:schemas-microsoft-com:vml" xmlns:wp14="http://schemas.microsoft.com/office/word/2010/wordprocessingDrawing" xmlns:wp="http://schemas.openxmlformats.org/drawingml/2006/wordprocessingDrawing" xmlns:w10="urn:schemas-microsoft-com:office:word" xmlns:w="http://schemas.openxmlformats.org/wordprocessingml/2006/main" xmlns:w14="http://schemas.microsoft.com/office/word/2010/wordml" xmlns:w15="http://schemas.microsoft.com/office/word/2012/wordml" xmlns:w16se="http://schemas.microsoft.com/office/word/2015/wordml/symex" xmlns:wpg="http://schemas.microsoft.com/office/word/2010/wordprocessingGroup" xmlns:wpi="http://schemas.microsoft.com/office/word/2010/wordprocessingInk" xmlns:wne="http://schemas.microsoft.com/office/word/2006/wordml" xmlns:wps="http://schemas.microsoft.com/office/word/2010/wordprocessingShape" mc:Ignorable="w14 w15 w16se wp14">
   <w:p>
     <w:pPr>
       <w:pStyle w:val="Footer"/>
@@ -5785,7 +5752,7 @@
 </file>
 
 <file path=word/footer2.xml><?xml version="1.0" encoding="utf-8"?>
-<w:ftr xmlns:wpc="http://schemas.microsoft.com/office/word/2010/wordprocessingCanvas" xmlns:cx="http://schemas.microsoft.com/office/drawing/2014/chartex" xmlns:cx1="http://schemas.microsoft.com/office/drawing/2015/9/8/chartex" xmlns:cx2="http://schemas.microsoft.com/office/drawing/2015/10/21/chartex" xmlns:cx3="http://schemas.microsoft.com/office/drawing/2016/5/9/chartex" xmlns:cx4="http://schemas.microsoft.com/office/drawing/2016/5/10/chartex" xmlns:cx5="http://schemas.microsoft.com/office/drawing/2016/5/11/chartex" xmlns:cx6="http://schemas.microsoft.com/office/drawing/2016/5/12/chartex" xmlns:cx7="http://schemas.microsoft.com/office/drawing/2016/5/13/chartex" xmlns:cx8="http://schemas.microsoft.com/office/drawing/2016/5/14/chartex" xmlns:mc="http://schemas.openxmlformats.org/markup-compatibility/2006" xmlns:aink="http://schemas.microsoft.com/office/drawing/2016/ink" xmlns:am3d="http://schemas.microsoft.com/office/drawing/2017/model3d" xmlns:o="urn:schemas-microsoft-com:office:office" xmlns:oel="http://schemas.microsoft.com/office/2019/extlst" xmlns:r="http://schemas.openxmlformats.org/officeDocument/2006/relationships" xmlns:m="http://schemas.openxmlformats.org/officeDocument/2006/math" xmlns:v="urn:schemas-microsoft-com:vml" xmlns:wp14="http://schemas.microsoft.com/office/word/2010/wordprocessingDrawing" xmlns:wp="http://schemas.openxmlformats.org/drawingml/2006/wordprocessingDrawing" xmlns:w10="urn:schemas-microsoft-com:office:word" xmlns:w="http://schemas.openxmlformats.org/wordprocessingml/2006/main" xmlns:w14="http://schemas.microsoft.com/office/word/2010/wordml" xmlns:w15="http://schemas.microsoft.com/office/word/2012/wordml" xmlns:w16cex="http://schemas.microsoft.com/office/word/2018/wordml/cex" xmlns:w16cid="http://schemas.microsoft.com/office/word/2016/wordml/cid" xmlns:w16="http://schemas.microsoft.com/office/word/2018/wordml" xmlns:w16du="http://schemas.microsoft.com/office/word/2023/wordml/word16du" xmlns:w16sdtdh="http://schemas.microsoft.com/office/word/2020/wordml/sdtdatahash" xmlns:w16sdtfl="http://schemas.microsoft.com/office/word/2024/wordml/sdtformatlock" xmlns:w16se="http://schemas.microsoft.com/office/word/2015/wordml/symex" xmlns:wpg="http://schemas.microsoft.com/office/word/2010/wordprocessingGroup" xmlns:wpi="http://schemas.microsoft.com/office/word/2010/wordprocessingInk" xmlns:wne="http://schemas.microsoft.com/office/word/2006/wordml" xmlns:wps="http://schemas.microsoft.com/office/word/2010/wordprocessingShape" mc:Ignorable="w14 w15 w16se w16cid w16 w16cex w16sdtdh w16sdtfl w16du wp14">
+<w:ftr xmlns:wpc="http://schemas.microsoft.com/office/word/2010/wordprocessingCanvas" xmlns:cx="http://schemas.microsoft.com/office/drawing/2014/chartex" xmlns:mc="http://schemas.openxmlformats.org/markup-compatibility/2006" xmlns:o="urn:schemas-microsoft-com:office:office" xmlns:r="http://schemas.openxmlformats.org/officeDocument/2006/relationships" xmlns:m="http://schemas.openxmlformats.org/officeDocument/2006/math" xmlns:v="urn:schemas-microsoft-com:vml" xmlns:wp14="http://schemas.microsoft.com/office/word/2010/wordprocessingDrawing" xmlns:wp="http://schemas.openxmlformats.org/drawingml/2006/wordprocessingDrawing" xmlns:w10="urn:schemas-microsoft-com:office:word" xmlns:w="http://schemas.openxmlformats.org/wordprocessingml/2006/main" xmlns:w14="http://schemas.microsoft.com/office/word/2010/wordml" xmlns:w15="http://schemas.microsoft.com/office/word/2012/wordml" xmlns:w16se="http://schemas.microsoft.com/office/word/2015/wordml/symex" xmlns:wpg="http://schemas.microsoft.com/office/word/2010/wordprocessingGroup" xmlns:wpi="http://schemas.microsoft.com/office/word/2010/wordprocessingInk" xmlns:wne="http://schemas.microsoft.com/office/word/2006/wordml" xmlns:wps="http://schemas.microsoft.com/office/word/2010/wordprocessingShape" mc:Ignorable="w14 w15 w16se wp14">
   <w:sdt>
     <w:sdtPr>
       <w:id w:val="-1303225305"/>
@@ -5818,7 +5785,7 @@
           <w:rPr>
             <w:noProof/>
           </w:rPr>
-          <w:t>2</w:t>
+          <w:t>4</w:t>
         </w:r>
         <w:r>
           <w:rPr>
@@ -5838,7 +5805,7 @@
 </file>
 
 <file path=word/footer3.xml><?xml version="1.0" encoding="utf-8"?>
-<w:ftr xmlns:wpc="http://schemas.microsoft.com/office/word/2010/wordprocessingCanvas" xmlns:cx="http://schemas.microsoft.com/office/drawing/2014/chartex" xmlns:cx1="http://schemas.microsoft.com/office/drawing/2015/9/8/chartex" xmlns:cx2="http://schemas.microsoft.com/office/drawing/2015/10/21/chartex" xmlns:cx3="http://schemas.microsoft.com/office/drawing/2016/5/9/chartex" xmlns:cx4="http://schemas.microsoft.com/office/drawing/2016/5/10/chartex" xmlns:cx5="http://schemas.microsoft.com/office/drawing/2016/5/11/chartex" xmlns:cx6="http://schemas.microsoft.com/office/drawing/2016/5/12/chartex" xmlns:cx7="http://schemas.microsoft.com/office/drawing/2016/5/13/chartex" xmlns:cx8="http://schemas.microsoft.com/office/drawing/2016/5/14/chartex" xmlns:mc="http://schemas.openxmlformats.org/markup-compatibility/2006" xmlns:aink="http://schemas.microsoft.com/office/drawing/2016/ink" xmlns:am3d="http://schemas.microsoft.com/office/drawing/2017/model3d" xmlns:o="urn:schemas-microsoft-com:office:office" xmlns:oel="http://schemas.microsoft.com/office/2019/extlst" xmlns:r="http://schemas.openxmlformats.org/officeDocument/2006/relationships" xmlns:m="http://schemas.openxmlformats.org/officeDocument/2006/math" xmlns:v="urn:schemas-microsoft-com:vml" xmlns:wp14="http://schemas.microsoft.com/office/word/2010/wordprocessingDrawing" xmlns:wp="http://schemas.openxmlformats.org/drawingml/2006/wordprocessingDrawing" xmlns:w10="urn:schemas-microsoft-com:office:word" xmlns:w="http://schemas.openxmlformats.org/wordprocessingml/2006/main" xmlns:w14="http://schemas.microsoft.com/office/word/2010/wordml" xmlns:w15="http://schemas.microsoft.com/office/word/2012/wordml" xmlns:w16cex="http://schemas.microsoft.com/office/word/2018/wordml/cex" xmlns:w16cid="http://schemas.microsoft.com/office/word/2016/wordml/cid" xmlns:w16="http://schemas.microsoft.com/office/word/2018/wordml" xmlns:w16du="http://schemas.microsoft.com/office/word/2023/wordml/word16du" xmlns:w16sdtdh="http://schemas.microsoft.com/office/word/2020/wordml/sdtdatahash" xmlns:w16sdtfl="http://schemas.microsoft.com/office/word/2024/wordml/sdtformatlock" xmlns:w16se="http://schemas.microsoft.com/office/word/2015/wordml/symex" xmlns:wpg="http://schemas.microsoft.com/office/word/2010/wordprocessingGroup" xmlns:wpi="http://schemas.microsoft.com/office/word/2010/wordprocessingInk" xmlns:wne="http://schemas.microsoft.com/office/word/2006/wordml" xmlns:wps="http://schemas.microsoft.com/office/word/2010/wordprocessingShape" mc:Ignorable="w14 w15 w16se w16cid w16 w16cex w16sdtdh w16sdtfl w16du wp14">
+<w:ftr xmlns:wpc="http://schemas.microsoft.com/office/word/2010/wordprocessingCanvas" xmlns:cx="http://schemas.microsoft.com/office/drawing/2014/chartex" xmlns:mc="http://schemas.openxmlformats.org/markup-compatibility/2006" xmlns:o="urn:schemas-microsoft-com:office:office" xmlns:r="http://schemas.openxmlformats.org/officeDocument/2006/relationships" xmlns:m="http://schemas.openxmlformats.org/officeDocument/2006/math" xmlns:v="urn:schemas-microsoft-com:vml" xmlns:wp14="http://schemas.microsoft.com/office/word/2010/wordprocessingDrawing" xmlns:wp="http://schemas.openxmlformats.org/drawingml/2006/wordprocessingDrawing" xmlns:w10="urn:schemas-microsoft-com:office:word" xmlns:w="http://schemas.openxmlformats.org/wordprocessingml/2006/main" xmlns:w14="http://schemas.microsoft.com/office/word/2010/wordml" xmlns:w15="http://schemas.microsoft.com/office/word/2012/wordml" xmlns:w16se="http://schemas.microsoft.com/office/word/2015/wordml/symex" xmlns:wpg="http://schemas.microsoft.com/office/word/2010/wordprocessingGroup" xmlns:wpi="http://schemas.microsoft.com/office/word/2010/wordprocessingInk" xmlns:wne="http://schemas.microsoft.com/office/word/2006/wordml" xmlns:wps="http://schemas.microsoft.com/office/word/2010/wordprocessingShape" mc:Ignorable="w14 w15 w16se wp14">
   <w:p>
     <w:pPr>
       <w:pStyle w:val="Footer"/>
@@ -5848,7 +5815,7 @@
 </file>
 
 <file path=word/footnotes.xml><?xml version="1.0" encoding="utf-8"?>
-<w:footnotes xmlns:wpc="http://schemas.microsoft.com/office/word/2010/wordprocessingCanvas" xmlns:cx="http://schemas.microsoft.com/office/drawing/2014/chartex" xmlns:cx1="http://schemas.microsoft.com/office/drawing/2015/9/8/chartex" xmlns:cx2="http://schemas.microsoft.com/office/drawing/2015/10/21/chartex" xmlns:cx3="http://schemas.microsoft.com/office/drawing/2016/5/9/chartex" xmlns:cx4="http://schemas.microsoft.com/office/drawing/2016/5/10/chartex" xmlns:cx5="http://schemas.microsoft.com/office/drawing/2016/5/11/chartex" xmlns:cx6="http://schemas.microsoft.com/office/drawing/2016/5/12/chartex" xmlns:cx7="http://schemas.microsoft.com/office/drawing/2016/5/13/chartex" xmlns:cx8="http://schemas.microsoft.com/office/drawing/2016/5/14/chartex" xmlns:mc="http://schemas.openxmlformats.org/markup-compatibility/2006" xmlns:aink="http://schemas.microsoft.com/office/drawing/2016/ink" xmlns:am3d="http://schemas.microsoft.com/office/drawing/2017/model3d" xmlns:o="urn:schemas-microsoft-com:office:office" xmlns:oel="http://schemas.microsoft.com/office/2019/extlst" xmlns:r="http://schemas.openxmlformats.org/officeDocument/2006/relationships" xmlns:m="http://schemas.openxmlformats.org/officeDocument/2006/math" xmlns:v="urn:schemas-microsoft-com:vml" xmlns:wp14="http://schemas.microsoft.com/office/word/2010/wordprocessingDrawing" xmlns:wp="http://schemas.openxmlformats.org/drawingml/2006/wordprocessingDrawing" xmlns:w10="urn:schemas-microsoft-com:office:word" xmlns:w="http://schemas.openxmlformats.org/wordprocessingml/2006/main" xmlns:w14="http://schemas.microsoft.com/office/word/2010/wordml" xmlns:w15="http://schemas.microsoft.com/office/word/2012/wordml" xmlns:w16cex="http://schemas.microsoft.com/office/word/2018/wordml/cex" xmlns:w16cid="http://schemas.microsoft.com/office/word/2016/wordml/cid" xmlns:w16="http://schemas.microsoft.com/office/word/2018/wordml" xmlns:w16du="http://schemas.microsoft.com/office/word/2023/wordml/word16du" xmlns:w16sdtdh="http://schemas.microsoft.com/office/word/2020/wordml/sdtdatahash" xmlns:w16sdtfl="http://schemas.microsoft.com/office/word/2024/wordml/sdtformatlock" xmlns:w16se="http://schemas.microsoft.com/office/word/2015/wordml/symex" xmlns:wpg="http://schemas.microsoft.com/office/word/2010/wordprocessingGroup" xmlns:wpi="http://schemas.microsoft.com/office/word/2010/wordprocessingInk" xmlns:wne="http://schemas.microsoft.com/office/word/2006/wordml" xmlns:wps="http://schemas.microsoft.com/office/word/2010/wordprocessingShape" mc:Ignorable="w14 w15 w16se w16cid w16 w16cex w16sdtdh w16sdtfl w16du wp14">
+<w:footnotes xmlns:wpc="http://schemas.microsoft.com/office/word/2010/wordprocessingCanvas" xmlns:cx="http://schemas.microsoft.com/office/drawing/2014/chartex" xmlns:mc="http://schemas.openxmlformats.org/markup-compatibility/2006" xmlns:o="urn:schemas-microsoft-com:office:office" xmlns:r="http://schemas.openxmlformats.org/officeDocument/2006/relationships" xmlns:m="http://schemas.openxmlformats.org/officeDocument/2006/math" xmlns:v="urn:schemas-microsoft-com:vml" xmlns:wp14="http://schemas.microsoft.com/office/word/2010/wordprocessingDrawing" xmlns:wp="http://schemas.openxmlformats.org/drawingml/2006/wordprocessingDrawing" xmlns:w10="urn:schemas-microsoft-com:office:word" xmlns:w="http://schemas.openxmlformats.org/wordprocessingml/2006/main" xmlns:w14="http://schemas.microsoft.com/office/word/2010/wordml" xmlns:w15="http://schemas.microsoft.com/office/word/2012/wordml" xmlns:w16se="http://schemas.microsoft.com/office/word/2015/wordml/symex" xmlns:wpg="http://schemas.microsoft.com/office/word/2010/wordprocessingGroup" xmlns:wpi="http://schemas.microsoft.com/office/word/2010/wordprocessingInk" xmlns:wne="http://schemas.microsoft.com/office/word/2006/wordml" xmlns:wps="http://schemas.microsoft.com/office/word/2010/wordprocessingShape" mc:Ignorable="w14 w15 w16se wp14">
   <w:footnote w:type="separator" w:id="-1">
     <w:p>
       <w:pPr>
@@ -5873,7 +5840,7 @@
 </file>
 
 <file path=word/header1.xml><?xml version="1.0" encoding="utf-8"?>
-<w:hdr xmlns:wpc="http://schemas.microsoft.com/office/word/2010/wordprocessingCanvas" xmlns:cx="http://schemas.microsoft.com/office/drawing/2014/chartex" xmlns:cx1="http://schemas.microsoft.com/office/drawing/2015/9/8/chartex" xmlns:cx2="http://schemas.microsoft.com/office/drawing/2015/10/21/chartex" xmlns:cx3="http://schemas.microsoft.com/office/drawing/2016/5/9/chartex" xmlns:cx4="http://schemas.microsoft.com/office/drawing/2016/5/10/chartex" xmlns:cx5="http://schemas.microsoft.com/office/drawing/2016/5/11/chartex" xmlns:cx6="http://schemas.microsoft.com/office/drawing/2016/5/12/chartex" xmlns:cx7="http://schemas.microsoft.com/office/drawing/2016/5/13/chartex" xmlns:cx8="http://schemas.microsoft.com/office/drawing/2016/5/14/chartex" xmlns:mc="http://schemas.openxmlformats.org/markup-compatibility/2006" xmlns:aink="http://schemas.microsoft.com/office/drawing/2016/ink" xmlns:am3d="http://schemas.microsoft.com/office/drawing/2017/model3d" xmlns:o="urn:schemas-microsoft-com:office:office" xmlns:oel="http://schemas.microsoft.com/office/2019/extlst" xmlns:r="http://schemas.openxmlformats.org/officeDocument/2006/relationships" xmlns:m="http://schemas.openxmlformats.org/officeDocument/2006/math" xmlns:v="urn:schemas-microsoft-com:vml" xmlns:wp14="http://schemas.microsoft.com/office/word/2010/wordprocessingDrawing" xmlns:wp="http://schemas.openxmlformats.org/drawingml/2006/wordprocessingDrawing" xmlns:w10="urn:schemas-microsoft-com:office:word" xmlns:w="http://schemas.openxmlformats.org/wordprocessingml/2006/main" xmlns:w14="http://schemas.microsoft.com/office/word/2010/wordml" xmlns:w15="http://schemas.microsoft.com/office/word/2012/wordml" xmlns:w16cex="http://schemas.microsoft.com/office/word/2018/wordml/cex" xmlns:w16cid="http://schemas.microsoft.com/office/word/2016/wordml/cid" xmlns:w16="http://schemas.microsoft.com/office/word/2018/wordml" xmlns:w16du="http://schemas.microsoft.com/office/word/2023/wordml/word16du" xmlns:w16sdtdh="http://schemas.microsoft.com/office/word/2020/wordml/sdtdatahash" xmlns:w16sdtfl="http://schemas.microsoft.com/office/word/2024/wordml/sdtformatlock" xmlns:w16se="http://schemas.microsoft.com/office/word/2015/wordml/symex" xmlns:wpg="http://schemas.microsoft.com/office/word/2010/wordprocessingGroup" xmlns:wpi="http://schemas.microsoft.com/office/word/2010/wordprocessingInk" xmlns:wne="http://schemas.microsoft.com/office/word/2006/wordml" xmlns:wps="http://schemas.microsoft.com/office/word/2010/wordprocessingShape" mc:Ignorable="w14 w15 w16se w16cid w16 w16cex w16sdtdh w16sdtfl w16du wp14">
+<w:hdr xmlns:wpc="http://schemas.microsoft.com/office/word/2010/wordprocessingCanvas" xmlns:cx="http://schemas.microsoft.com/office/drawing/2014/chartex" xmlns:mc="http://schemas.openxmlformats.org/markup-compatibility/2006" xmlns:o="urn:schemas-microsoft-com:office:office" xmlns:r="http://schemas.openxmlformats.org/officeDocument/2006/relationships" xmlns:m="http://schemas.openxmlformats.org/officeDocument/2006/math" xmlns:v="urn:schemas-microsoft-com:vml" xmlns:wp14="http://schemas.microsoft.com/office/word/2010/wordprocessingDrawing" xmlns:wp="http://schemas.openxmlformats.org/drawingml/2006/wordprocessingDrawing" xmlns:w10="urn:schemas-microsoft-com:office:word" xmlns:w="http://schemas.openxmlformats.org/wordprocessingml/2006/main" xmlns:w14="http://schemas.microsoft.com/office/word/2010/wordml" xmlns:w15="http://schemas.microsoft.com/office/word/2012/wordml" xmlns:w16se="http://schemas.microsoft.com/office/word/2015/wordml/symex" xmlns:wpg="http://schemas.microsoft.com/office/word/2010/wordprocessingGroup" xmlns:wpi="http://schemas.microsoft.com/office/word/2010/wordprocessingInk" xmlns:wne="http://schemas.microsoft.com/office/word/2006/wordml" xmlns:wps="http://schemas.microsoft.com/office/word/2010/wordprocessingShape" mc:Ignorable="w14 w15 w16se wp14">
   <w:p>
     <w:pPr>
       <w:pStyle w:val="Header"/>
@@ -5883,7 +5850,7 @@
 </file>
 
 <file path=word/header2.xml><?xml version="1.0" encoding="utf-8"?>
-<w:hdr xmlns:wpc="http://schemas.microsoft.com/office/word/2010/wordprocessingCanvas" xmlns:cx="http://schemas.microsoft.com/office/drawing/2014/chartex" xmlns:cx1="http://schemas.microsoft.com/office/drawing/2015/9/8/chartex" xmlns:cx2="http://schemas.microsoft.com/office/drawing/2015/10/21/chartex" xmlns:cx3="http://schemas.microsoft.com/office/drawing/2016/5/9/chartex" xmlns:cx4="http://schemas.microsoft.com/office/drawing/2016/5/10/chartex" xmlns:cx5="http://schemas.microsoft.com/office/drawing/2016/5/11/chartex" xmlns:cx6="http://schemas.microsoft.com/office/drawing/2016/5/12/chartex" xmlns:cx7="http://schemas.microsoft.com/office/drawing/2016/5/13/chartex" xmlns:cx8="http://schemas.microsoft.com/office/drawing/2016/5/14/chartex" xmlns:mc="http://schemas.openxmlformats.org/markup-compatibility/2006" xmlns:aink="http://schemas.microsoft.com/office/drawing/2016/ink" xmlns:am3d="http://schemas.microsoft.com/office/drawing/2017/model3d" xmlns:o="urn:schemas-microsoft-com:office:office" xmlns:oel="http://schemas.microsoft.com/office/2019/extlst" xmlns:r="http://schemas.openxmlformats.org/officeDocument/2006/relationships" xmlns:m="http://schemas.openxmlformats.org/officeDocument/2006/math" xmlns:v="urn:schemas-microsoft-com:vml" xmlns:wp14="http://schemas.microsoft.com/office/word/2010/wordprocessingDrawing" xmlns:wp="http://schemas.openxmlformats.org/drawingml/2006/wordprocessingDrawing" xmlns:w10="urn:schemas-microsoft-com:office:word" xmlns:w="http://schemas.openxmlformats.org/wordprocessingml/2006/main" xmlns:w14="http://schemas.microsoft.com/office/word/2010/wordml" xmlns:w15="http://schemas.microsoft.com/office/word/2012/wordml" xmlns:w16cex="http://schemas.microsoft.com/office/word/2018/wordml/cex" xmlns:w16cid="http://schemas.microsoft.com/office/word/2016/wordml/cid" xmlns:w16="http://schemas.microsoft.com/office/word/2018/wordml" xmlns:w16du="http://schemas.microsoft.com/office/word/2023/wordml/word16du" xmlns:w16sdtdh="http://schemas.microsoft.com/office/word/2020/wordml/sdtdatahash" xmlns:w16sdtfl="http://schemas.microsoft.com/office/word/2024/wordml/sdtformatlock" xmlns:w16se="http://schemas.microsoft.com/office/word/2015/wordml/symex" xmlns:wpg="http://schemas.microsoft.com/office/word/2010/wordprocessingGroup" xmlns:wpi="http://schemas.microsoft.com/office/word/2010/wordprocessingInk" xmlns:wne="http://schemas.microsoft.com/office/word/2006/wordml" xmlns:wps="http://schemas.microsoft.com/office/word/2010/wordprocessingShape" mc:Ignorable="w14 w15 w16se w16cid w16 w16cex w16sdtdh w16sdtfl w16du wp14">
+<w:hdr xmlns:wpc="http://schemas.microsoft.com/office/word/2010/wordprocessingCanvas" xmlns:cx="http://schemas.microsoft.com/office/drawing/2014/chartex" xmlns:mc="http://schemas.openxmlformats.org/markup-compatibility/2006" xmlns:o="urn:schemas-microsoft-com:office:office" xmlns:r="http://schemas.openxmlformats.org/officeDocument/2006/relationships" xmlns:m="http://schemas.openxmlformats.org/officeDocument/2006/math" xmlns:v="urn:schemas-microsoft-com:vml" xmlns:wp14="http://schemas.microsoft.com/office/word/2010/wordprocessingDrawing" xmlns:wp="http://schemas.openxmlformats.org/drawingml/2006/wordprocessingDrawing" xmlns:w10="urn:schemas-microsoft-com:office:word" xmlns:w="http://schemas.openxmlformats.org/wordprocessingml/2006/main" xmlns:w14="http://schemas.microsoft.com/office/word/2010/wordml" xmlns:w15="http://schemas.microsoft.com/office/word/2012/wordml" xmlns:w16se="http://schemas.microsoft.com/office/word/2015/wordml/symex" xmlns:wpg="http://schemas.microsoft.com/office/word/2010/wordprocessingGroup" xmlns:wpi="http://schemas.microsoft.com/office/word/2010/wordprocessingInk" xmlns:wne="http://schemas.microsoft.com/office/word/2006/wordml" xmlns:wps="http://schemas.microsoft.com/office/word/2010/wordprocessingShape" mc:Ignorable="w14 w15 w16se wp14">
   <w:p>
     <w:pPr>
       <w:pStyle w:val="Header"/>
@@ -5967,7 +5934,7 @@
             </wp:anchor>
           </w:drawing>
         </mc:Choice>
-        <mc:Fallback>
+        <mc:Fallback xmlns:w16sdtfl="http://schemas.microsoft.com/office/word/2024/wordml/sdtformatlock" xmlns:w16sdtdh="http://schemas.microsoft.com/office/word/2020/wordml/sdtdatahash" xmlns:w16du="http://schemas.microsoft.com/office/word/2023/wordml/word16du" xmlns:w16="http://schemas.microsoft.com/office/word/2018/wordml" xmlns:w16cid="http://schemas.microsoft.com/office/word/2016/wordml/cid" xmlns:w16cex="http://schemas.microsoft.com/office/word/2018/wordml/cex" xmlns:oel="http://schemas.microsoft.com/office/2019/extlst" xmlns:am3d="http://schemas.microsoft.com/office/drawing/2017/model3d" xmlns:aink="http://schemas.microsoft.com/office/drawing/2016/ink" xmlns:cx8="http://schemas.microsoft.com/office/drawing/2016/5/14/chartex" xmlns:cx7="http://schemas.microsoft.com/office/drawing/2016/5/13/chartex" xmlns:cx6="http://schemas.microsoft.com/office/drawing/2016/5/12/chartex" xmlns:cx5="http://schemas.microsoft.com/office/drawing/2016/5/11/chartex" xmlns:cx4="http://schemas.microsoft.com/office/drawing/2016/5/10/chartex" xmlns:cx3="http://schemas.microsoft.com/office/drawing/2016/5/9/chartex" xmlns:cx2="http://schemas.microsoft.com/office/drawing/2015/10/21/chartex" xmlns:cx1="http://schemas.microsoft.com/office/drawing/2015/9/8/chartex">
           <w:pict>
             <v:rect w14:anchorId="2203ED89" id="Rectangle 1" o:spid="_x0000_s1026" style="position:absolute;margin-left:-71.15pt;margin-top:-43.2pt;width:614.7pt;height:70.5pt;z-index:-251657216;visibility:visible;mso-wrap-style:square;mso-width-percent:0;mso-wrap-distance-left:9pt;mso-wrap-distance-top:0;mso-wrap-distance-right:9pt;mso-wrap-distance-bottom:0;mso-position-horizontal:absolute;mso-position-horizontal-relative:text;mso-position-vertical:absolute;mso-position-vertical-relative:text;mso-width-percent:0;mso-width-relative:margin;v-text-anchor:middle" o:gfxdata="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" fillcolor="#80bddc" stroked="f" strokeweight="1pt"/>
           </w:pict>
@@ -6198,7 +6165,7 @@
             </wp:anchor>
           </w:drawing>
         </mc:Choice>
-        <mc:Fallback>
+        <mc:Fallback xmlns:w16sdtfl="http://schemas.microsoft.com/office/word/2024/wordml/sdtformatlock" xmlns:w16sdtdh="http://schemas.microsoft.com/office/word/2020/wordml/sdtdatahash" xmlns:w16du="http://schemas.microsoft.com/office/word/2023/wordml/word16du" xmlns:w16="http://schemas.microsoft.com/office/word/2018/wordml" xmlns:w16cid="http://schemas.microsoft.com/office/word/2016/wordml/cid" xmlns:w16cex="http://schemas.microsoft.com/office/word/2018/wordml/cex" xmlns:oel="http://schemas.microsoft.com/office/2019/extlst" xmlns:am3d="http://schemas.microsoft.com/office/drawing/2017/model3d" xmlns:aink="http://schemas.microsoft.com/office/drawing/2016/ink" xmlns:cx8="http://schemas.microsoft.com/office/drawing/2016/5/14/chartex" xmlns:cx7="http://schemas.microsoft.com/office/drawing/2016/5/13/chartex" xmlns:cx6="http://schemas.microsoft.com/office/drawing/2016/5/12/chartex" xmlns:cx5="http://schemas.microsoft.com/office/drawing/2016/5/11/chartex" xmlns:cx4="http://schemas.microsoft.com/office/drawing/2016/5/10/chartex" xmlns:cx3="http://schemas.microsoft.com/office/drawing/2016/5/9/chartex" xmlns:cx2="http://schemas.microsoft.com/office/drawing/2015/10/21/chartex" xmlns:cx1="http://schemas.microsoft.com/office/drawing/2015/9/8/chartex">
           <w:pict>
             <v:shapetype w14:anchorId="719D2D00" id="_x0000_t202" coordsize="21600,21600" o:spt="202" path="m,l,21600r21600,l21600,xe">
               <v:stroke joinstyle="miter"/>
@@ -6237,7 +6204,7 @@
 </file>
 
 <file path=word/header3.xml><?xml version="1.0" encoding="utf-8"?>
-<w:hdr xmlns:wpc="http://schemas.microsoft.com/office/word/2010/wordprocessingCanvas" xmlns:cx="http://schemas.microsoft.com/office/drawing/2014/chartex" xmlns:cx1="http://schemas.microsoft.com/office/drawing/2015/9/8/chartex" xmlns:cx2="http://schemas.microsoft.com/office/drawing/2015/10/21/chartex" xmlns:cx3="http://schemas.microsoft.com/office/drawing/2016/5/9/chartex" xmlns:cx4="http://schemas.microsoft.com/office/drawing/2016/5/10/chartex" xmlns:cx5="http://schemas.microsoft.com/office/drawing/2016/5/11/chartex" xmlns:cx6="http://schemas.microsoft.com/office/drawing/2016/5/12/chartex" xmlns:cx7="http://schemas.microsoft.com/office/drawing/2016/5/13/chartex" xmlns:cx8="http://schemas.microsoft.com/office/drawing/2016/5/14/chartex" xmlns:mc="http://schemas.openxmlformats.org/markup-compatibility/2006" xmlns:aink="http://schemas.microsoft.com/office/drawing/2016/ink" xmlns:am3d="http://schemas.microsoft.com/office/drawing/2017/model3d" xmlns:o="urn:schemas-microsoft-com:office:office" xmlns:oel="http://schemas.microsoft.com/office/2019/extlst" xmlns:r="http://schemas.openxmlformats.org/officeDocument/2006/relationships" xmlns:m="http://schemas.openxmlformats.org/officeDocument/2006/math" xmlns:v="urn:schemas-microsoft-com:vml" xmlns:wp14="http://schemas.microsoft.com/office/word/2010/wordprocessingDrawing" xmlns:wp="http://schemas.openxmlformats.org/drawingml/2006/wordprocessingDrawing" xmlns:w10="urn:schemas-microsoft-com:office:word" xmlns:w="http://schemas.openxmlformats.org/wordprocessingml/2006/main" xmlns:w14="http://schemas.microsoft.com/office/word/2010/wordml" xmlns:w15="http://schemas.microsoft.com/office/word/2012/wordml" xmlns:w16cex="http://schemas.microsoft.com/office/word/2018/wordml/cex" xmlns:w16cid="http://schemas.microsoft.com/office/word/2016/wordml/cid" xmlns:w16="http://schemas.microsoft.com/office/word/2018/wordml" xmlns:w16du="http://schemas.microsoft.com/office/word/2023/wordml/word16du" xmlns:w16sdtdh="http://schemas.microsoft.com/office/word/2020/wordml/sdtdatahash" xmlns:w16sdtfl="http://schemas.microsoft.com/office/word/2024/wordml/sdtformatlock" xmlns:w16se="http://schemas.microsoft.com/office/word/2015/wordml/symex" xmlns:wpg="http://schemas.microsoft.com/office/word/2010/wordprocessingGroup" xmlns:wpi="http://schemas.microsoft.com/office/word/2010/wordprocessingInk" xmlns:wne="http://schemas.microsoft.com/office/word/2006/wordml" xmlns:wps="http://schemas.microsoft.com/office/word/2010/wordprocessingShape" mc:Ignorable="w14 w15 w16se w16cid w16 w16cex w16sdtdh w16sdtfl w16du wp14">
+<w:hdr xmlns:wpc="http://schemas.microsoft.com/office/word/2010/wordprocessingCanvas" xmlns:cx="http://schemas.microsoft.com/office/drawing/2014/chartex" xmlns:mc="http://schemas.openxmlformats.org/markup-compatibility/2006" xmlns:o="urn:schemas-microsoft-com:office:office" xmlns:r="http://schemas.openxmlformats.org/officeDocument/2006/relationships" xmlns:m="http://schemas.openxmlformats.org/officeDocument/2006/math" xmlns:v="urn:schemas-microsoft-com:vml" xmlns:wp14="http://schemas.microsoft.com/office/word/2010/wordprocessingDrawing" xmlns:wp="http://schemas.openxmlformats.org/drawingml/2006/wordprocessingDrawing" xmlns:w10="urn:schemas-microsoft-com:office:word" xmlns:w="http://schemas.openxmlformats.org/wordprocessingml/2006/main" xmlns:w14="http://schemas.microsoft.com/office/word/2010/wordml" xmlns:w15="http://schemas.microsoft.com/office/word/2012/wordml" xmlns:w16se="http://schemas.microsoft.com/office/word/2015/wordml/symex" xmlns:wpg="http://schemas.microsoft.com/office/word/2010/wordprocessingGroup" xmlns:wpi="http://schemas.microsoft.com/office/word/2010/wordprocessingInk" xmlns:wne="http://schemas.microsoft.com/office/word/2006/wordml" xmlns:wps="http://schemas.microsoft.com/office/word/2010/wordprocessingShape" mc:Ignorable="w14 w15 w16se wp14">
   <w:p>
     <w:pPr>
       <w:pStyle w:val="Header"/>
@@ -6247,7 +6214,7 @@
 </file>
 
 <file path=word/numbering.xml><?xml version="1.0" encoding="utf-8"?>
-<w:numbering xmlns:wpc="http://schemas.microsoft.com/office/word/2010/wordprocessingCanvas" xmlns:cx="http://schemas.microsoft.com/office/drawing/2014/chartex" xmlns:cx1="http://schemas.microsoft.com/office/drawing/2015/9/8/chartex" xmlns:cx2="http://schemas.microsoft.com/office/drawing/2015/10/21/chartex" xmlns:cx3="http://schemas.microsoft.com/office/drawing/2016/5/9/chartex" xmlns:cx4="http://schemas.microsoft.com/office/drawing/2016/5/10/chartex" xmlns:cx5="http://schemas.microsoft.com/office/drawing/2016/5/11/chartex" xmlns:cx6="http://schemas.microsoft.com/office/drawing/2016/5/12/chartex" xmlns:cx7="http://schemas.microsoft.com/office/drawing/2016/5/13/chartex" xmlns:cx8="http://schemas.microsoft.com/office/drawing/2016/5/14/chartex" xmlns:mc="http://schemas.openxmlformats.org/markup-compatibility/2006" xmlns:aink="http://schemas.microsoft.com/office/drawing/2016/ink" xmlns:am3d="http://schemas.microsoft.com/office/drawing/2017/model3d" xmlns:o="urn:schemas-microsoft-com:office:office" xmlns:oel="http://schemas.microsoft.com/office/2019/extlst" xmlns:r="http://schemas.openxmlformats.org/officeDocument/2006/relationships" xmlns:m="http://schemas.openxmlformats.org/officeDocument/2006/math" xmlns:v="urn:schemas-microsoft-com:vml" xmlns:wp14="http://schemas.microsoft.com/office/word/2010/wordprocessingDrawing" xmlns:wp="http://schemas.openxmlformats.org/drawingml/2006/wordprocessingDrawing" xmlns:w10="urn:schemas-microsoft-com:office:word" xmlns:w="http://schemas.openxmlformats.org/wordprocessingml/2006/main" xmlns:w14="http://schemas.microsoft.com/office/word/2010/wordml" xmlns:w15="http://schemas.microsoft.com/office/word/2012/wordml" xmlns:w16cex="http://schemas.microsoft.com/office/word/2018/wordml/cex" xmlns:w16cid="http://schemas.microsoft.com/office/word/2016/wordml/cid" xmlns:w16="http://schemas.microsoft.com/office/word/2018/wordml" xmlns:w16du="http://schemas.microsoft.com/office/word/2023/wordml/word16du" xmlns:w16sdtdh="http://schemas.microsoft.com/office/word/2020/wordml/sdtdatahash" xmlns:w16sdtfl="http://schemas.microsoft.com/office/word/2024/wordml/sdtformatlock" xmlns:w16se="http://schemas.microsoft.com/office/word/2015/wordml/symex" xmlns:wpg="http://schemas.microsoft.com/office/word/2010/wordprocessingGroup" xmlns:wpi="http://schemas.microsoft.com/office/word/2010/wordprocessingInk" xmlns:wne="http://schemas.microsoft.com/office/word/2006/wordml" xmlns:wps="http://schemas.microsoft.com/office/word/2010/wordprocessingShape" mc:Ignorable="w14 w15 w16se w16cid w16 w16cex w16sdtdh w16sdtfl w16du wp14">
+<w:numbering xmlns:wpc="http://schemas.microsoft.com/office/word/2010/wordprocessingCanvas" xmlns:cx="http://schemas.microsoft.com/office/drawing/2014/chartex" xmlns:mc="http://schemas.openxmlformats.org/markup-compatibility/2006" xmlns:o="urn:schemas-microsoft-com:office:office" xmlns:r="http://schemas.openxmlformats.org/officeDocument/2006/relationships" xmlns:m="http://schemas.openxmlformats.org/officeDocument/2006/math" xmlns:v="urn:schemas-microsoft-com:vml" xmlns:wp14="http://schemas.microsoft.com/office/word/2010/wordprocessingDrawing" xmlns:wp="http://schemas.openxmlformats.org/drawingml/2006/wordprocessingDrawing" xmlns:w10="urn:schemas-microsoft-com:office:word" xmlns:w="http://schemas.openxmlformats.org/wordprocessingml/2006/main" xmlns:w14="http://schemas.microsoft.com/office/word/2010/wordml" xmlns:w15="http://schemas.microsoft.com/office/word/2012/wordml" xmlns:w16se="http://schemas.microsoft.com/office/word/2015/wordml/symex" xmlns:wpg="http://schemas.microsoft.com/office/word/2010/wordprocessingGroup" xmlns:wpi="http://schemas.microsoft.com/office/word/2010/wordprocessingInk" xmlns:wne="http://schemas.microsoft.com/office/word/2006/wordml" xmlns:wps="http://schemas.microsoft.com/office/word/2010/wordprocessingShape" mc:Ignorable="w14 w15 w16se wp14">
   <w:abstractNum w:abstractNumId="0" w15:restartNumberingAfterBreak="0">
     <w:nsid w:val="06175F98"/>
     <w:multiLevelType w:val="multilevel"/>
@@ -7239,6 +7206,92 @@
     </w:lvl>
   </w:abstractNum>
   <w:abstractNum w:abstractNumId="8" w15:restartNumberingAfterBreak="0">
+    <w:nsid w:val="5EC878CF"/>
+    <w:multiLevelType w:val="hybridMultilevel"/>
+    <w:tmpl w:val="1D92E09C"/>
+    <w:lvl w:ilvl="0" w:tplc="0409000F">
+      <w:start w:val="1"/>
+      <w:numFmt w:val="decimal"/>
+      <w:lvlText w:val="%1."/>
+      <w:lvlJc w:val="left"/>
+      <w:pPr>
+        <w:ind w:left="720" w:hanging="360"/>
+      </w:pPr>
+    </w:lvl>
+    <w:lvl w:ilvl="1" w:tplc="04090019" w:tentative="1">
+      <w:start w:val="1"/>
+      <w:numFmt w:val="lowerLetter"/>
+      <w:lvlText w:val="%2."/>
+      <w:lvlJc w:val="left"/>
+      <w:pPr>
+        <w:ind w:left="1440" w:hanging="360"/>
+      </w:pPr>
+    </w:lvl>
+    <w:lvl w:ilvl="2" w:tplc="0409001B" w:tentative="1">
+      <w:start w:val="1"/>
+      <w:numFmt w:val="lowerRoman"/>
+      <w:lvlText w:val="%3."/>
+      <w:lvlJc w:val="right"/>
+      <w:pPr>
+        <w:ind w:left="2160" w:hanging="180"/>
+      </w:pPr>
+    </w:lvl>
+    <w:lvl w:ilvl="3" w:tplc="0409000F" w:tentative="1">
+      <w:start w:val="1"/>
+      <w:numFmt w:val="decimal"/>
+      <w:lvlText w:val="%4."/>
+      <w:lvlJc w:val="left"/>
+      <w:pPr>
+        <w:ind w:left="2880" w:hanging="360"/>
+      </w:pPr>
+    </w:lvl>
+    <w:lvl w:ilvl="4" w:tplc="04090019" w:tentative="1">
+      <w:start w:val="1"/>
+      <w:numFmt w:val="lowerLetter"/>
+      <w:lvlText w:val="%5."/>
+      <w:lvlJc w:val="left"/>
+      <w:pPr>
+        <w:ind w:left="3600" w:hanging="360"/>
+      </w:pPr>
+    </w:lvl>
+    <w:lvl w:ilvl="5" w:tplc="0409001B" w:tentative="1">
+      <w:start w:val="1"/>
+      <w:numFmt w:val="lowerRoman"/>
+      <w:lvlText w:val="%6."/>
+      <w:lvlJc w:val="right"/>
+      <w:pPr>
+        <w:ind w:left="4320" w:hanging="180"/>
+      </w:pPr>
+    </w:lvl>
+    <w:lvl w:ilvl="6" w:tplc="0409000F" w:tentative="1">
+      <w:start w:val="1"/>
+      <w:numFmt w:val="decimal"/>
+      <w:lvlText w:val="%7."/>
+      <w:lvlJc w:val="left"/>
+      <w:pPr>
+        <w:ind w:left="5040" w:hanging="360"/>
+      </w:pPr>
+    </w:lvl>
+    <w:lvl w:ilvl="7" w:tplc="04090019" w:tentative="1">
+      <w:start w:val="1"/>
+      <w:numFmt w:val="lowerLetter"/>
+      <w:lvlText w:val="%8."/>
+      <w:lvlJc w:val="left"/>
+      <w:pPr>
+        <w:ind w:left="5760" w:hanging="360"/>
+      </w:pPr>
+    </w:lvl>
+    <w:lvl w:ilvl="8" w:tplc="0409001B" w:tentative="1">
+      <w:start w:val="1"/>
+      <w:numFmt w:val="lowerRoman"/>
+      <w:lvlText w:val="%9."/>
+      <w:lvlJc w:val="right"/>
+      <w:pPr>
+        <w:ind w:left="6480" w:hanging="180"/>
+      </w:pPr>
+    </w:lvl>
+  </w:abstractNum>
+  <w:abstractNum w:abstractNumId="9" w15:restartNumberingAfterBreak="0">
     <w:nsid w:val="685729B1"/>
     <w:multiLevelType w:val="multilevel"/>
     <w:tmpl w:val="5C06A718"/>
@@ -7387,7 +7440,7 @@
       </w:rPr>
     </w:lvl>
   </w:abstractNum>
-  <w:abstractNum w:abstractNumId="9" w15:restartNumberingAfterBreak="0">
+  <w:abstractNum w:abstractNumId="10" w15:restartNumberingAfterBreak="0">
     <w:nsid w:val="6A1B656A"/>
     <w:multiLevelType w:val="multilevel"/>
     <w:tmpl w:val="E4701ADA"/>
@@ -7536,7 +7589,7 @@
       </w:rPr>
     </w:lvl>
   </w:abstractNum>
-  <w:abstractNum w:abstractNumId="10" w15:restartNumberingAfterBreak="0">
+  <w:abstractNum w:abstractNumId="11" w15:restartNumberingAfterBreak="0">
     <w:nsid w:val="7935424A"/>
     <w:multiLevelType w:val="hybridMultilevel"/>
     <w:tmpl w:val="9D9E25AC"/>
@@ -7625,44 +7678,47 @@
       </w:pPr>
     </w:lvl>
   </w:abstractNum>
-  <w:num w:numId="1" w16cid:durableId="1324241246">
+  <w:num w:numId="1">
     <w:abstractNumId w:val="7"/>
   </w:num>
-  <w:num w:numId="2" w16cid:durableId="472452147">
+  <w:num w:numId="2">
     <w:abstractNumId w:val="3"/>
   </w:num>
-  <w:num w:numId="3" w16cid:durableId="1002859188">
+  <w:num w:numId="3">
     <w:abstractNumId w:val="5"/>
   </w:num>
-  <w:num w:numId="4" w16cid:durableId="1293437891">
+  <w:num w:numId="4">
+    <w:abstractNumId w:val="11"/>
+  </w:num>
+  <w:num w:numId="5">
+    <w:abstractNumId w:val="6"/>
+  </w:num>
+  <w:num w:numId="6">
+    <w:abstractNumId w:val="4"/>
+  </w:num>
+  <w:num w:numId="7">
+    <w:abstractNumId w:val="2"/>
+  </w:num>
+  <w:num w:numId="8">
+    <w:abstractNumId w:val="1"/>
+  </w:num>
+  <w:num w:numId="9">
+    <w:abstractNumId w:val="9"/>
+  </w:num>
+  <w:num w:numId="10">
+    <w:abstractNumId w:val="0"/>
+  </w:num>
+  <w:num w:numId="11">
     <w:abstractNumId w:val="10"/>
   </w:num>
-  <w:num w:numId="5" w16cid:durableId="1805005445">
-    <w:abstractNumId w:val="6"/>
-  </w:num>
-  <w:num w:numId="6" w16cid:durableId="33894643">
-    <w:abstractNumId w:val="4"/>
-  </w:num>
-  <w:num w:numId="7" w16cid:durableId="957639297">
-    <w:abstractNumId w:val="2"/>
-  </w:num>
-  <w:num w:numId="8" w16cid:durableId="1731686451">
-    <w:abstractNumId w:val="1"/>
-  </w:num>
-  <w:num w:numId="9" w16cid:durableId="1513716967">
+  <w:num w:numId="12">
     <w:abstractNumId w:val="8"/>
-  </w:num>
-  <w:num w:numId="10" w16cid:durableId="1089353423">
-    <w:abstractNumId w:val="0"/>
-  </w:num>
-  <w:num w:numId="11" w16cid:durableId="957371913">
-    <w:abstractNumId w:val="9"/>
   </w:num>
 </w:numbering>
 </file>
 
 <file path=word/styles.xml><?xml version="1.0" encoding="utf-8"?>
-<w:styles xmlns:mc="http://schemas.openxmlformats.org/markup-compatibility/2006" xmlns:r="http://schemas.openxmlformats.org/officeDocument/2006/relationships" xmlns:w="http://schemas.openxmlformats.org/wordprocessingml/2006/main" xmlns:w14="http://schemas.microsoft.com/office/word/2010/wordml" xmlns:w15="http://schemas.microsoft.com/office/word/2012/wordml" xmlns:w16cex="http://schemas.microsoft.com/office/word/2018/wordml/cex" xmlns:w16cid="http://schemas.microsoft.com/office/word/2016/wordml/cid" xmlns:w16="http://schemas.microsoft.com/office/word/2018/wordml" xmlns:w16du="http://schemas.microsoft.com/office/word/2023/wordml/word16du" xmlns:w16sdtdh="http://schemas.microsoft.com/office/word/2020/wordml/sdtdatahash" xmlns:w16sdtfl="http://schemas.microsoft.com/office/word/2024/wordml/sdtformatlock" xmlns:w16se="http://schemas.microsoft.com/office/word/2015/wordml/symex" mc:Ignorable="w14 w15 w16se w16cid w16 w16cex w16sdtdh w16sdtfl w16du">
+<w:styles xmlns:mc="http://schemas.openxmlformats.org/markup-compatibility/2006" xmlns:r="http://schemas.openxmlformats.org/officeDocument/2006/relationships" xmlns:w="http://schemas.openxmlformats.org/wordprocessingml/2006/main" xmlns:w14="http://schemas.microsoft.com/office/word/2010/wordml" xmlns:w15="http://schemas.microsoft.com/office/word/2012/wordml" xmlns:w16se="http://schemas.microsoft.com/office/word/2015/wordml/symex" mc:Ignorable="w14 w15 w16se">
   <w:docDefaults>
     <w:rPrDefault>
       <w:rPr>
@@ -7680,7 +7736,7 @@
       </w:pPr>
     </w:pPrDefault>
   </w:docDefaults>
-  <w:latentStyles w:defLockedState="0" w:defUIPriority="99" w:defSemiHidden="0" w:defUnhideWhenUsed="0" w:defQFormat="0" w:count="376">
+  <w:latentStyles w:defLockedState="0" w:defUIPriority="99" w:defSemiHidden="0" w:defUnhideWhenUsed="0" w:defQFormat="0" w:count="371">
     <w:lsdException w:name="Normal" w:uiPriority="0" w:qFormat="1"/>
     <w:lsdException w:name="heading 1" w:uiPriority="9" w:qFormat="1"/>
     <w:lsdException w:name="heading 2" w:semiHidden="1" w:uiPriority="9" w:unhideWhenUsed="1" w:qFormat="1"/>
@@ -8052,11 +8108,6 @@
     <w:lsdException w:name="List Table 5 Dark Accent 6" w:uiPriority="50"/>
     <w:lsdException w:name="List Table 6 Colorful Accent 6" w:uiPriority="51"/>
     <w:lsdException w:name="List Table 7 Colorful Accent 6" w:uiPriority="52"/>
-    <w:lsdException w:name="Mention" w:semiHidden="1" w:unhideWhenUsed="1"/>
-    <w:lsdException w:name="Smart Hyperlink" w:semiHidden="1" w:unhideWhenUsed="1"/>
-    <w:lsdException w:name="Hashtag" w:semiHidden="1" w:unhideWhenUsed="1"/>
-    <w:lsdException w:name="Unresolved Mention" w:semiHidden="1" w:unhideWhenUsed="1"/>
-    <w:lsdException w:name="Smart Link" w:semiHidden="1" w:unhideWhenUsed="1"/>
   </w:latentStyles>
   <w:style w:type="paragraph" w:default="1" w:styleId="Normal">
     <w:name w:val="Normal"/>
@@ -8263,6 +8314,7 @@
   <w:style w:type="character" w:default="1" w:styleId="DefaultParagraphFont">
     <w:name w:val="Default Paragraph Font"/>
     <w:uiPriority w:val="1"/>
+    <w:semiHidden/>
     <w:unhideWhenUsed/>
   </w:style>
   <w:style w:type="table" w:default="1" w:styleId="TableNormal">
@@ -9016,7 +9068,7 @@
 </file>
 
 <file path=customXml/itemProps1.xml><?xml version="1.0" encoding="utf-8"?>
-<ds:datastoreItem xmlns:ds="http://schemas.openxmlformats.org/officeDocument/2006/customXml" ds:itemID="{575CF576-5EE2-4411-A076-50482EFDBD73}">
+<ds:datastoreItem xmlns:ds="http://schemas.openxmlformats.org/officeDocument/2006/customXml" ds:itemID="{DA1A3FE5-78AF-42F2-992A-FE9F6242EC9C}">
   <ds:schemaRefs>
     <ds:schemaRef ds:uri="http://schemas.openxmlformats.org/officeDocument/2006/bibliography"/>
   </ds:schemaRefs>

</xml_diff>